<commit_message>
Document Spotify preprocessing notebook
Add a detailed markdown overview to notebooks/spotify_preprocess_cli.ipynb explaining the streaming, memory-efficient two-pass preprocessing pipeline: chunked CSV reads, immediate cleaning, metadata normalization, lyrics fingerprinting (MD5), duplicate removal, IQR-based word-count bounds learned in pass 1 and applied in pass 2, and final output to spotify_clean.csv. Also update Documentation/PROJECT_report_fixed.docx (binary change). This clarifies the notebook's approach and usage for users and maintainers.
</commit_message>
<xml_diff>
--- a/Documentation/PROJECT_report_fixed.docx
+++ b/Documentation/PROJECT_report_fixed.docx
@@ -409,7 +409,21 @@
               <w:rPr>
                 <w:rFonts w:ascii="Times New Roman" w:hAnsi="Times New Roman" w:cs="Times New Roman"/>
               </w:rPr>
-              <w:t xml:space="preserve">Dheeraj Basera </w:t>
+              <w:t xml:space="preserve">Dheeraj </w:t>
+            </w:r>
+            <w:proofErr w:type="spellStart"/>
+            <w:r>
+              <w:rPr>
+                <w:rFonts w:ascii="Times New Roman" w:hAnsi="Times New Roman" w:cs="Times New Roman"/>
+              </w:rPr>
+              <w:t>Basera</w:t>
+            </w:r>
+            <w:proofErr w:type="spellEnd"/>
+            <w:r>
+              <w:rPr>
+                <w:rFonts w:ascii="Times New Roman" w:hAnsi="Times New Roman" w:cs="Times New Roman"/>
+              </w:rPr>
+              <w:t xml:space="preserve"> </w:t>
             </w:r>
           </w:p>
         </w:tc>
@@ -720,7 +734,7 @@
         <w:jc w:val="center"/>
       </w:pPr>
       <w:r>
-        <w:t>Mentor  :  Amit Kumar</w:t>
+        <w:t>Mentor:  Amit Kumar</w:t>
       </w:r>
     </w:p>
     <w:p>
@@ -1278,7 +1292,35 @@
         <w:rPr>
           <w:rFonts w:ascii="Times New Roman" w:hAnsi="Times New Roman" w:cs="Times New Roman"/>
         </w:rPr>
-        <w:t>The rapid expansion of digital music platforms has increased the demand for accurate and personalized recommendation systems. Most existing systems rely primarily on user behavior, genre classification, audio features, or popularity trends. Lyrical content, despite carrying emotional tone, thematic structure, and expressive meaning, remains insufficiently analyzed in mainstream recommendation models.</w:t>
+        <w:t xml:space="preserve">The rapid expansion of digital music platforms has increased the demand for accurate and personalized recommendation systems. Most existing systems rely primarily on user </w:t>
+      </w:r>
+      <w:proofErr w:type="spellStart"/>
+      <w:r>
+        <w:rPr>
+          <w:rFonts w:ascii="Times New Roman" w:hAnsi="Times New Roman" w:cs="Times New Roman"/>
+        </w:rPr>
+        <w:t>behavior</w:t>
+      </w:r>
+      <w:proofErr w:type="spellEnd"/>
+      <w:r>
+        <w:rPr>
+          <w:rFonts w:ascii="Times New Roman" w:hAnsi="Times New Roman" w:cs="Times New Roman"/>
+        </w:rPr>
+        <w:t xml:space="preserve">, genre classification, audio features, or popularity trends. Lyrical content, despite carrying emotional tone, thematic structure, and expressive meaning, remains insufficiently </w:t>
+      </w:r>
+      <w:proofErr w:type="spellStart"/>
+      <w:r>
+        <w:rPr>
+          <w:rFonts w:ascii="Times New Roman" w:hAnsi="Times New Roman" w:cs="Times New Roman"/>
+        </w:rPr>
+        <w:t>analyzed</w:t>
+      </w:r>
+      <w:proofErr w:type="spellEnd"/>
+      <w:r>
+        <w:rPr>
+          <w:rFonts w:ascii="Times New Roman" w:hAnsi="Times New Roman" w:cs="Times New Roman"/>
+        </w:rPr>
+        <w:t xml:space="preserve"> in mainstream recommendation models.</w:t>
       </w:r>
     </w:p>
     <w:p>
@@ -1601,6 +1643,7 @@
       <w:pPr>
         <w:spacing w:after="0" w:line="259" w:lineRule="auto"/>
         <w:ind w:left="0" w:firstLine="0"/>
+        <w:jc w:val="both"/>
         <w:rPr>
           <w:rFonts w:ascii="Times New Roman" w:hAnsi="Times New Roman" w:cs="Times New Roman"/>
         </w:rPr>
@@ -1616,7 +1659,35 @@
         <w:rPr>
           <w:rFonts w:ascii="Times New Roman" w:hAnsi="Times New Roman" w:cs="Times New Roman"/>
         </w:rPr>
-        <w:t>The system integrates core AI and machine learning techniques to analyze lyrical content and group similar songs. The selected methods emphasize interpretability, structured modeling, and computational efficiency.</w:t>
+        <w:t xml:space="preserve">The system integrates core AI and machine learning techniques to </w:t>
+      </w:r>
+      <w:proofErr w:type="spellStart"/>
+      <w:r>
+        <w:rPr>
+          <w:rFonts w:ascii="Times New Roman" w:hAnsi="Times New Roman" w:cs="Times New Roman"/>
+        </w:rPr>
+        <w:t>analyze</w:t>
+      </w:r>
+      <w:proofErr w:type="spellEnd"/>
+      <w:r>
+        <w:rPr>
+          <w:rFonts w:ascii="Times New Roman" w:hAnsi="Times New Roman" w:cs="Times New Roman"/>
+        </w:rPr>
+        <w:t xml:space="preserve"> lyrical content and group similar songs. The selected methods emphasize interpretability, structured </w:t>
+      </w:r>
+      <w:proofErr w:type="spellStart"/>
+      <w:r>
+        <w:rPr>
+          <w:rFonts w:ascii="Times New Roman" w:hAnsi="Times New Roman" w:cs="Times New Roman"/>
+        </w:rPr>
+        <w:t>modeling</w:t>
+      </w:r>
+      <w:proofErr w:type="spellEnd"/>
+      <w:r>
+        <w:rPr>
+          <w:rFonts w:ascii="Times New Roman" w:hAnsi="Times New Roman" w:cs="Times New Roman"/>
+        </w:rPr>
+        <w:t>, and computational efficiency.</w:t>
       </w:r>
     </w:p>
     <w:p>
@@ -1760,7 +1831,15 @@
         <w:jc w:val="both"/>
       </w:pPr>
       <w:r>
-        <w:t>Modern music listeners often seek songs that convey similar emotions or themes, independent of artist, era, or genre. Conventional recommendation systems predominantly rely on collaborative filtering, listening history, and popularity metrics, while the expressive and thematic depth of lyrics remains underutilized. Since lyrics encapsulate storytelling, emotional tone, and conceptual structure, analyzing them can significantly enhance personalization.</w:t>
+        <w:t xml:space="preserve">Modern music listeners often seek songs that convey similar emotions or themes, independent of artist, era, or genre. Conventional recommendation systems predominantly rely on collaborative filtering, listening history, and popularity metrics, while the expressive and thematic depth of lyrics remains underutilized. Since lyrics encapsulate storytelling, emotional tone, and conceptual structure, </w:t>
+      </w:r>
+      <w:proofErr w:type="spellStart"/>
+      <w:r>
+        <w:t>analyzing</w:t>
+      </w:r>
+      <w:proofErr w:type="spellEnd"/>
+      <w:r>
+        <w:t xml:space="preserve"> them can significantly enhance personalization.</w:t>
       </w:r>
     </w:p>
     <w:p>
@@ -1804,7 +1883,15 @@
         <w:jc w:val="both"/>
       </w:pPr>
       <w:r>
-        <w:t>The project adopts structured feature-based modeling and statistical text representation instead of complex linguistic models to ensure interpretability, reduced computational overhead, and clear academic traceability of results. The objective is to improve music discovery by systematically identifying lyrical patterns using transparent and scalable AI techniques.</w:t>
+        <w:t xml:space="preserve">The project adopts structured feature-based </w:t>
+      </w:r>
+      <w:proofErr w:type="spellStart"/>
+      <w:r>
+        <w:t>modeling</w:t>
+      </w:r>
+      <w:proofErr w:type="spellEnd"/>
+      <w:r>
+        <w:t xml:space="preserve"> and statistical text representation instead of complex linguistic models to ensure interpretability, reduced computational overhead, and clear academic traceability of results. The objective is to improve music discovery by systematically identifying lyrical patterns using transparent and scalable AI techniques.</w:t>
       </w:r>
     </w:p>
     <w:p>
@@ -2053,7 +2140,21 @@
         <w:rPr>
           <w:rFonts w:ascii="Times New Roman" w:hAnsi="Times New Roman" w:cs="Times New Roman"/>
         </w:rPr>
-        <w:t>Despite significant advancements in music recommendation systems, lyrical content remains insufficiently integrated into similarity modeling, even though it strongly influences emotional engagement and listener preference. Most existing systems prioritize user interaction history, genre classification, and audio-based attributes, while the semantic and structural aspects of lyrics receive limited analytical attention.</w:t>
+        <w:t xml:space="preserve">Despite significant advancements in music recommendation systems, lyrical content remains insufficiently integrated into similarity </w:t>
+      </w:r>
+      <w:proofErr w:type="spellStart"/>
+      <w:r>
+        <w:rPr>
+          <w:rFonts w:ascii="Times New Roman" w:hAnsi="Times New Roman" w:cs="Times New Roman"/>
+        </w:rPr>
+        <w:t>modeling</w:t>
+      </w:r>
+      <w:proofErr w:type="spellEnd"/>
+      <w:r>
+        <w:rPr>
+          <w:rFonts w:ascii="Times New Roman" w:hAnsi="Times New Roman" w:cs="Times New Roman"/>
+        </w:rPr>
+        <w:t>, even though it strongly influences emotional engagement and listener preference. Most existing systems prioritize user interaction history, genre classification, and audio-based attributes, while the semantic and structural aspects of lyrics receive limited analytical attention.</w:t>
       </w:r>
     </w:p>
     <w:p>
@@ -2075,14 +2176,42 @@
           <w:rFonts w:ascii="Times New Roman" w:hAnsi="Times New Roman" w:cs="Times New Roman"/>
         </w:rPr>
         <w:br/>
-        <w:t>• Inadequate modeling of lyrical similarity</w:t>
+        <w:t xml:space="preserve">• Inadequate </w:t>
+      </w:r>
+      <w:proofErr w:type="spellStart"/>
+      <w:r>
+        <w:rPr>
+          <w:rFonts w:ascii="Times New Roman" w:hAnsi="Times New Roman" w:cs="Times New Roman"/>
+        </w:rPr>
+        <w:t>modeling</w:t>
+      </w:r>
+      <w:proofErr w:type="spellEnd"/>
+      <w:r>
+        <w:rPr>
+          <w:rFonts w:ascii="Times New Roman" w:hAnsi="Times New Roman" w:cs="Times New Roman"/>
+        </w:rPr>
+        <w:t xml:space="preserve"> of lyrical similarity</w:t>
       </w:r>
       <w:r>
         <w:rPr>
           <w:rFonts w:ascii="Times New Roman" w:hAnsi="Times New Roman" w:cs="Times New Roman"/>
         </w:rPr>
         <w:br/>
-        <w:t>• Overreliance on historical behavior and genre-based categorization</w:t>
+        <w:t xml:space="preserve">• Overreliance on historical </w:t>
+      </w:r>
+      <w:proofErr w:type="spellStart"/>
+      <w:r>
+        <w:rPr>
+          <w:rFonts w:ascii="Times New Roman" w:hAnsi="Times New Roman" w:cs="Times New Roman"/>
+        </w:rPr>
+        <w:t>behavior</w:t>
+      </w:r>
+      <w:proofErr w:type="spellEnd"/>
+      <w:r>
+        <w:rPr>
+          <w:rFonts w:ascii="Times New Roman" w:hAnsi="Times New Roman" w:cs="Times New Roman"/>
+        </w:rPr>
+        <w:t xml:space="preserve"> and genre-based categorization</w:t>
       </w:r>
       <w:r>
         <w:rPr>
@@ -2219,8 +2348,16 @@
         <w:rPr>
           <w:rFonts w:ascii="Times New Roman" w:hAnsi="Times New Roman" w:cs="Times New Roman"/>
         </w:rPr>
-        <w:t>• Music streaming platforms aiming to enhance recommendation accuracy through lyrical similarity modeling</w:t>
-      </w:r>
+        <w:t xml:space="preserve">• Music streaming platforms aiming to enhance recommendation accuracy through lyrical similarity </w:t>
+      </w:r>
+      <w:proofErr w:type="spellStart"/>
+      <w:r>
+        <w:rPr>
+          <w:rFonts w:ascii="Times New Roman" w:hAnsi="Times New Roman" w:cs="Times New Roman"/>
+        </w:rPr>
+        <w:t>modeling</w:t>
+      </w:r>
+      <w:proofErr w:type="spellEnd"/>
       <w:r>
         <w:rPr>
           <w:rFonts w:ascii="Times New Roman" w:hAnsi="Times New Roman" w:cs="Times New Roman"/>
@@ -2254,7 +2391,21 @@
           <w:rFonts w:ascii="Times New Roman" w:hAnsi="Times New Roman" w:cs="Times New Roman"/>
         </w:rPr>
         <w:br/>
-        <w:t>• Artists and producers analyzing lyrical structures and thematic trends for creative insight</w:t>
+        <w:t xml:space="preserve">• Artists and producers </w:t>
+      </w:r>
+      <w:proofErr w:type="spellStart"/>
+      <w:r>
+        <w:rPr>
+          <w:rFonts w:ascii="Times New Roman" w:hAnsi="Times New Roman" w:cs="Times New Roman"/>
+        </w:rPr>
+        <w:t>analyzing</w:t>
+      </w:r>
+      <w:proofErr w:type="spellEnd"/>
+      <w:r>
+        <w:rPr>
+          <w:rFonts w:ascii="Times New Roman" w:hAnsi="Times New Roman" w:cs="Times New Roman"/>
+        </w:rPr>
+        <w:t xml:space="preserve"> lyrical structures and thematic trends for creative insight</w:t>
       </w:r>
     </w:p>
     <w:p>
@@ -2804,16 +2955,41 @@
       <w:pPr>
         <w:pStyle w:val="NormalWeb"/>
       </w:pPr>
-      <w:r>
-        <w:t>title,artist,lyrics</w:t>
-      </w:r>
+      <w:proofErr w:type="spellStart"/>
+      <w:proofErr w:type="gramStart"/>
+      <w:r>
+        <w:t>title,artist</w:t>
+      </w:r>
+      <w:proofErr w:type="gramEnd"/>
+      <w:r>
+        <w:t>,lyrics</w:t>
+      </w:r>
+      <w:proofErr w:type="spellEnd"/>
     </w:p>
     <w:p>
       <w:pPr>
         <w:pStyle w:val="NormalWeb"/>
       </w:pPr>
       <w:r>
-        <w:t>Let It Be,The Beatles,"When I find myself in times of trouble..."</w:t>
+        <w:t xml:space="preserve">Let It </w:t>
+      </w:r>
+      <w:proofErr w:type="spellStart"/>
+      <w:proofErr w:type="gramStart"/>
+      <w:r>
+        <w:t>Be,The</w:t>
+      </w:r>
+      <w:proofErr w:type="spellEnd"/>
+      <w:proofErr w:type="gramEnd"/>
+      <w:r>
+        <w:t xml:space="preserve"> </w:t>
+      </w:r>
+      <w:proofErr w:type="spellStart"/>
+      <w:r>
+        <w:t>Beatles,"When</w:t>
+      </w:r>
+      <w:proofErr w:type="spellEnd"/>
+      <w:r>
+        <w:t xml:space="preserve"> I find myself in times of trouble..."</w:t>
       </w:r>
     </w:p>
     <w:p>
@@ -2821,7 +2997,20 @@
         <w:pStyle w:val="NormalWeb"/>
       </w:pPr>
       <w:r>
-        <w:t>Someone Like You,Adele,"I heard that you're settled down..."</w:t>
+        <w:t xml:space="preserve">Someone Like </w:t>
+      </w:r>
+      <w:proofErr w:type="spellStart"/>
+      <w:proofErr w:type="gramStart"/>
+      <w:r>
+        <w:t>You,Adele</w:t>
+      </w:r>
+      <w:proofErr w:type="gramEnd"/>
+      <w:r>
+        <w:t>,"I</w:t>
+      </w:r>
+      <w:proofErr w:type="spellEnd"/>
+      <w:r>
+        <w:t xml:space="preserve"> heard that you're settled down..."</w:t>
       </w:r>
     </w:p>
     <w:p>
@@ -2929,8 +3118,13 @@
         <w:pStyle w:val="NormalWeb"/>
       </w:pPr>
       <w:r>
-        <w:t>Based on the full development roadmap :</w:t>
-      </w:r>
+        <w:t xml:space="preserve">Based on the full development </w:t>
+      </w:r>
+      <w:proofErr w:type="gramStart"/>
+      <w:r>
+        <w:t>roadmap :</w:t>
+      </w:r>
+      <w:proofErr w:type="gramEnd"/>
     </w:p>
     <w:p>
       <w:pPr>
@@ -3078,9 +3272,11 @@
           <w:numId w:val="15"/>
         </w:numPr>
       </w:pPr>
+      <w:proofErr w:type="spellStart"/>
       <w:r>
         <w:t>total_words</w:t>
       </w:r>
+      <w:proofErr w:type="spellEnd"/>
     </w:p>
     <w:p>
       <w:pPr>
@@ -3090,9 +3286,11 @@
           <w:numId w:val="15"/>
         </w:numPr>
       </w:pPr>
+      <w:proofErr w:type="spellStart"/>
       <w:r>
         <w:t>unique_words</w:t>
       </w:r>
+      <w:proofErr w:type="spellEnd"/>
     </w:p>
     <w:p>
       <w:pPr>
@@ -3102,9 +3300,11 @@
           <w:numId w:val="15"/>
         </w:numPr>
       </w:pPr>
+      <w:proofErr w:type="spellStart"/>
       <w:r>
         <w:t>lexical_diversity</w:t>
       </w:r>
+      <w:proofErr w:type="spellEnd"/>
     </w:p>
     <w:p>
       <w:pPr>
@@ -3114,9 +3314,11 @@
           <w:numId w:val="15"/>
         </w:numPr>
       </w:pPr>
+      <w:proofErr w:type="spellStart"/>
       <w:r>
         <w:t>repetition_score</w:t>
       </w:r>
+      <w:proofErr w:type="spellEnd"/>
     </w:p>
     <w:p>
       <w:pPr>
@@ -3126,9 +3328,11 @@
           <w:numId w:val="15"/>
         </w:numPr>
       </w:pPr>
+      <w:proofErr w:type="spellStart"/>
       <w:r>
         <w:t>top_word_frequency</w:t>
       </w:r>
+      <w:proofErr w:type="spellEnd"/>
     </w:p>
     <w:p>
       <w:pPr>
@@ -3138,9 +3342,11 @@
           <w:numId w:val="15"/>
         </w:numPr>
       </w:pPr>
+      <w:proofErr w:type="spellStart"/>
       <w:r>
         <w:t>number_of_lines</w:t>
       </w:r>
+      <w:proofErr w:type="spellEnd"/>
     </w:p>
     <w:p>
       <w:pPr>
@@ -3150,9 +3356,11 @@
           <w:numId w:val="15"/>
         </w:numPr>
       </w:pPr>
+      <w:proofErr w:type="spellStart"/>
       <w:r>
         <w:t>average_line_length</w:t>
       </w:r>
+      <w:proofErr w:type="spellEnd"/>
     </w:p>
     <w:p>
       <w:pPr>
@@ -3162,9 +3370,11 @@
           <w:numId w:val="15"/>
         </w:numPr>
       </w:pPr>
+      <w:proofErr w:type="spellStart"/>
       <w:r>
         <w:t>line_length_variance</w:t>
       </w:r>
+      <w:proofErr w:type="spellEnd"/>
     </w:p>
     <w:p>
       <w:pPr>
@@ -3174,9 +3384,11 @@
           <w:numId w:val="15"/>
         </w:numPr>
       </w:pPr>
+      <w:proofErr w:type="spellStart"/>
       <w:r>
         <w:t>emotion_word_count</w:t>
       </w:r>
+      <w:proofErr w:type="spellEnd"/>
     </w:p>
     <w:p>
       <w:pPr>
@@ -3186,9 +3398,11 @@
           <w:numId w:val="15"/>
         </w:numPr>
       </w:pPr>
+      <w:proofErr w:type="spellStart"/>
       <w:r>
         <w:t>emotion_density</w:t>
       </w:r>
+      <w:proofErr w:type="spellEnd"/>
     </w:p>
     <w:p>
       <w:pPr>
@@ -3311,8 +3525,21 @@
         <w:pStyle w:val="NormalWeb"/>
       </w:pPr>
       <w:r>
-        <w:t>No audio features, user behavior data, semantic embeddings, or transformer-based representations are used, consistent with the roadmap and system design .</w:t>
-      </w:r>
+        <w:t xml:space="preserve">No audio features, user </w:t>
+      </w:r>
+      <w:proofErr w:type="spellStart"/>
+      <w:r>
+        <w:t>behavior</w:t>
+      </w:r>
+      <w:proofErr w:type="spellEnd"/>
+      <w:r>
+        <w:t xml:space="preserve"> data, semantic embeddings, or transformer-based representations are used, consistent with the roadmap and system </w:t>
+      </w:r>
+      <w:proofErr w:type="gramStart"/>
+      <w:r>
+        <w:t>design .</w:t>
+      </w:r>
+      <w:proofErr w:type="gramEnd"/>
     </w:p>
     <w:p>
       <w:pPr>
@@ -3418,8 +3645,13 @@
         </w:numPr>
       </w:pPr>
       <w:r>
-        <w:t>Pattern recognition modeling</w:t>
-      </w:r>
+        <w:t xml:space="preserve">Pattern recognition </w:t>
+      </w:r>
+      <w:proofErr w:type="spellStart"/>
+      <w:r>
+        <w:t>modeling</w:t>
+      </w:r>
+      <w:proofErr w:type="spellEnd"/>
     </w:p>
     <w:p>
       <w:pPr>
@@ -3481,7 +3713,15 @@
         <w:pStyle w:val="NormalWeb"/>
       </w:pPr>
       <w:r>
-        <w:t>The primary dataset consists of structured English song lyrics stored in CSV format, where each row represents a single song with its title, artist name, and complete lyrical content. The lyrics field serves as the sole modeling input and is transformed into a structured numerical feature vector for unsupervised clustering and similarity-based recommendation generation.</w:t>
+        <w:t xml:space="preserve">The primary dataset consists of structured English song lyrics stored in CSV format, where each row represents a single song with its title, artist name, and complete lyrical content. The lyrics field serves as the sole </w:t>
+      </w:r>
+      <w:proofErr w:type="spellStart"/>
+      <w:r>
+        <w:t>modeling</w:t>
+      </w:r>
+      <w:proofErr w:type="spellEnd"/>
+      <w:r>
+        <w:t xml:space="preserve"> input and is transformed into a structured numerical feature vector for unsupervised clustering and similarity-based recommendation generation.</w:t>
       </w:r>
     </w:p>
     <w:p>
@@ -3645,7 +3885,21 @@
         <w:rPr>
           <w:rFonts w:ascii="Times New Roman" w:hAnsi="Times New Roman" w:cs="Times New Roman"/>
         </w:rPr>
-        <w:t>These datasets are stored in data/raw/ and passed through preprocessing before any modeling.</w:t>
+        <w:t xml:space="preserve">These datasets are stored in data/raw/ and passed through preprocessing before any </w:t>
+      </w:r>
+      <w:proofErr w:type="spellStart"/>
+      <w:r>
+        <w:rPr>
+          <w:rFonts w:ascii="Times New Roman" w:hAnsi="Times New Roman" w:cs="Times New Roman"/>
+        </w:rPr>
+        <w:t>modeling</w:t>
+      </w:r>
+      <w:proofErr w:type="spellEnd"/>
+      <w:r>
+        <w:rPr>
+          <w:rFonts w:ascii="Times New Roman" w:hAnsi="Times New Roman" w:cs="Times New Roman"/>
+        </w:rPr>
+        <w:t>.</w:t>
       </w:r>
     </w:p>
     <w:p>
@@ -3790,8 +4044,16 @@
         <w:rPr>
           <w:rFonts w:cs="Times New Roman"/>
         </w:rPr>
-        <w:t>3. AZLyrics</w:t>
-      </w:r>
+        <w:t xml:space="preserve">3. </w:t>
+      </w:r>
+      <w:proofErr w:type="spellStart"/>
+      <w:r>
+        <w:rPr>
+          <w:rFonts w:cs="Times New Roman"/>
+        </w:rPr>
+        <w:t>AZLyrics</w:t>
+      </w:r>
+      <w:proofErr w:type="spellEnd"/>
     </w:p>
     <w:p>
       <w:pPr>
@@ -3894,7 +4156,21 @@
         <w:rPr>
           <w:rFonts w:cs="Times New Roman"/>
         </w:rPr>
-        <w:t>4. Lyrics.ovh API</w:t>
+        <w:t xml:space="preserve">4. </w:t>
+      </w:r>
+      <w:proofErr w:type="spellStart"/>
+      <w:r>
+        <w:rPr>
+          <w:rFonts w:cs="Times New Roman"/>
+        </w:rPr>
+        <w:t>Lyrics.ovh</w:t>
+      </w:r>
+      <w:proofErr w:type="spellEnd"/>
+      <w:r>
+        <w:rPr>
+          <w:rFonts w:cs="Times New Roman"/>
+        </w:rPr>
+        <w:t xml:space="preserve"> API</w:t>
       </w:r>
     </w:p>
     <w:p>
@@ -3942,7 +4218,21 @@
         <w:rPr>
           <w:rFonts w:ascii="Times New Roman" w:hAnsi="Times New Roman" w:cs="Times New Roman"/>
         </w:rPr>
-        <w:t>Automated collection of specific artist–song pairs</w:t>
+        <w:t xml:space="preserve">Automated collection of specific </w:t>
+      </w:r>
+      <w:proofErr w:type="gramStart"/>
+      <w:r>
+        <w:rPr>
+          <w:rFonts w:ascii="Times New Roman" w:hAnsi="Times New Roman" w:cs="Times New Roman"/>
+        </w:rPr>
+        <w:t>artist</w:t>
+      </w:r>
+      <w:proofErr w:type="gramEnd"/>
+      <w:r>
+        <w:rPr>
+          <w:rFonts w:ascii="Times New Roman" w:hAnsi="Times New Roman" w:cs="Times New Roman"/>
+        </w:rPr>
+        <w:t>–song pairs</w:t>
       </w:r>
     </w:p>
     <w:p>
@@ -4118,8 +4408,16 @@
         <w:rPr>
           <w:rFonts w:ascii="Times New Roman" w:hAnsi="Times New Roman" w:cs="Times New Roman"/>
         </w:rPr>
-        <w:t>Metadata-based modeling</w:t>
-      </w:r>
+        <w:t xml:space="preserve">Metadata-based </w:t>
+      </w:r>
+      <w:proofErr w:type="spellStart"/>
+      <w:r>
+        <w:rPr>
+          <w:rFonts w:ascii="Times New Roman" w:hAnsi="Times New Roman" w:cs="Times New Roman"/>
+        </w:rPr>
+        <w:t>modeling</w:t>
+      </w:r>
+      <w:proofErr w:type="spellEnd"/>
     </w:p>
     <w:p>
       <w:pPr>
@@ -4136,7 +4434,21 @@
         <w:rPr>
           <w:rFonts w:ascii="Times New Roman" w:hAnsi="Times New Roman" w:cs="Times New Roman"/>
         </w:rPr>
-        <w:t>User behavior analysis</w:t>
+        <w:t xml:space="preserve">User </w:t>
+      </w:r>
+      <w:proofErr w:type="spellStart"/>
+      <w:r>
+        <w:rPr>
+          <w:rFonts w:ascii="Times New Roman" w:hAnsi="Times New Roman" w:cs="Times New Roman"/>
+        </w:rPr>
+        <w:t>behavior</w:t>
+      </w:r>
+      <w:proofErr w:type="spellEnd"/>
+      <w:r>
+        <w:rPr>
+          <w:rFonts w:ascii="Times New Roman" w:hAnsi="Times New Roman" w:cs="Times New Roman"/>
+        </w:rPr>
+        <w:t xml:space="preserve"> analysis</w:t>
       </w:r>
     </w:p>
     <w:p>
@@ -4156,6 +4468,12 @@
         </w:rPr>
         <w:t>Any form of supervised learnin</w:t>
       </w:r>
+      <w:r>
+        <w:rPr>
+          <w:rFonts w:ascii="Times New Roman" w:hAnsi="Times New Roman" w:cs="Times New Roman"/>
+        </w:rPr>
+        <w:t>g</w:t>
+      </w:r>
     </w:p>
     <w:p>
       <w:pPr>
@@ -4181,7 +4499,21 @@
         <w:rPr>
           <w:rFonts w:ascii="Times New Roman" w:hAnsi="Times New Roman" w:cs="Times New Roman"/>
         </w:rPr>
-        <w:t>Music recommendation systems have evolved significantly with the advancement of artificial intelligence and machine learning techniques. Most existing systems primarily rely on collaborative filtering, content-based filtering, and hybrid models that incorporate user behavior, audio features, and metadata. However, the integration of lyrical content as a primary feature remains comparatively underexplored. This section reviews relevant studies aligned with clustering-based recommendation systems and lyric-driven analysis.</w:t>
+        <w:t xml:space="preserve">Music recommendation systems have evolved significantly with the advancement of artificial intelligence and machine learning techniques. Most existing systems primarily rely on collaborative filtering, content-based filtering, and hybrid models that incorporate user </w:t>
+      </w:r>
+      <w:proofErr w:type="spellStart"/>
+      <w:r>
+        <w:rPr>
+          <w:rFonts w:ascii="Times New Roman" w:hAnsi="Times New Roman" w:cs="Times New Roman"/>
+        </w:rPr>
+        <w:t>behavior</w:t>
+      </w:r>
+      <w:proofErr w:type="spellEnd"/>
+      <w:r>
+        <w:rPr>
+          <w:rFonts w:ascii="Times New Roman" w:hAnsi="Times New Roman" w:cs="Times New Roman"/>
+        </w:rPr>
+        <w:t>, audio features, and metadata. However, the integration of lyrical content as a primary feature remains comparatively underexplored. This section reviews relevant studies aligned with clustering-based recommendation systems and lyric-driven analysis.</w:t>
       </w:r>
     </w:p>
     <w:p>
@@ -4230,7 +4562,49 @@
         <w:rPr>
           <w:rFonts w:ascii="Times New Roman" w:hAnsi="Times New Roman" w:cs="Times New Roman"/>
         </w:rPr>
-        <w:t xml:space="preserve"> (Revue d’Intelligence Artificielle, IIETA) demonstrates the effectiveness of integrating content-based filtering with K-Means clustering to group similar songs. The authors show that clustering algorithms can identify meaningful patterns within structured feature vectors and improve recommendation quality without relying solely on user history. The research validates the suitability of K-Means as an unsupervised technique for organizing music data. However, the study incorporates broader content attributes and does not isolate lyrical structure as the sole modeling input.</w:t>
+        <w:t xml:space="preserve"> (Revue </w:t>
+      </w:r>
+      <w:proofErr w:type="spellStart"/>
+      <w:r>
+        <w:rPr>
+          <w:rFonts w:ascii="Times New Roman" w:hAnsi="Times New Roman" w:cs="Times New Roman"/>
+        </w:rPr>
+        <w:t>d’Intelligence</w:t>
+      </w:r>
+      <w:proofErr w:type="spellEnd"/>
+      <w:r>
+        <w:rPr>
+          <w:rFonts w:ascii="Times New Roman" w:hAnsi="Times New Roman" w:cs="Times New Roman"/>
+        </w:rPr>
+        <w:t xml:space="preserve"> </w:t>
+      </w:r>
+      <w:proofErr w:type="spellStart"/>
+      <w:r>
+        <w:rPr>
+          <w:rFonts w:ascii="Times New Roman" w:hAnsi="Times New Roman" w:cs="Times New Roman"/>
+        </w:rPr>
+        <w:t>Artificielle</w:t>
+      </w:r>
+      <w:proofErr w:type="spellEnd"/>
+      <w:r>
+        <w:rPr>
+          <w:rFonts w:ascii="Times New Roman" w:hAnsi="Times New Roman" w:cs="Times New Roman"/>
+        </w:rPr>
+        <w:t xml:space="preserve">, IIETA) demonstrates the effectiveness of integrating content-based filtering with K-Means clustering to group similar songs. The authors show that clustering algorithms can identify meaningful patterns within structured feature vectors and improve recommendation quality without relying solely on user history. The research validates the suitability of K-Means as an unsupervised technique for organizing music data. However, the study incorporates broader content attributes and does not isolate lyrical structure as the sole </w:t>
+      </w:r>
+      <w:proofErr w:type="spellStart"/>
+      <w:r>
+        <w:rPr>
+          <w:rFonts w:ascii="Times New Roman" w:hAnsi="Times New Roman" w:cs="Times New Roman"/>
+        </w:rPr>
+        <w:t>modeling</w:t>
+      </w:r>
+      <w:proofErr w:type="spellEnd"/>
+      <w:r>
+        <w:rPr>
+          <w:rFonts w:ascii="Times New Roman" w:hAnsi="Times New Roman" w:cs="Times New Roman"/>
+        </w:rPr>
+        <w:t xml:space="preserve"> input.</w:t>
       </w:r>
     </w:p>
     <w:p>
@@ -4259,7 +4633,21 @@
         <w:rPr>
           <w:rFonts w:ascii="Times New Roman" w:hAnsi="Times New Roman" w:cs="Times New Roman"/>
         </w:rPr>
-        <w:t xml:space="preserve"> (IJERT) discusses conventional architectures such as collaborative filtering and hybrid recommendation systems. While it establishes the technical foundation of recommendation frameworks, it emphasizes user interaction data and popularity metrics. Lyrical structure and textual pattern modeling are not central to its methodology, indicating a gap in lyric-focused approaches.</w:t>
+        <w:t xml:space="preserve"> (IJERT) discusses conventional architectures such as collaborative filtering and hybrid recommendation systems. While it establishes the technical foundation of recommendation frameworks, it emphasizes user interaction data and popularity metrics. Lyrical structure and textual pattern </w:t>
+      </w:r>
+      <w:proofErr w:type="spellStart"/>
+      <w:r>
+        <w:rPr>
+          <w:rFonts w:ascii="Times New Roman" w:hAnsi="Times New Roman" w:cs="Times New Roman"/>
+        </w:rPr>
+        <w:t>modeling</w:t>
+      </w:r>
+      <w:proofErr w:type="spellEnd"/>
+      <w:r>
+        <w:rPr>
+          <w:rFonts w:ascii="Times New Roman" w:hAnsi="Times New Roman" w:cs="Times New Roman"/>
+        </w:rPr>
+        <w:t xml:space="preserve"> are not central to its methodology, indicating a gap in lyric-focused approaches.</w:t>
       </w:r>
     </w:p>
     <w:p>
@@ -4308,7 +4696,21 @@
         <w:rPr>
           <w:rFonts w:ascii="Times New Roman" w:hAnsi="Times New Roman" w:cs="Times New Roman"/>
         </w:rPr>
-        <w:t xml:space="preserve"> examines supervised learning techniques applied to Spotify’s structured audio attributes. The study demonstrates the strong predictive performance of machine learning models trained on features such as tempo, energy, and loudness. Although it confirms the applicability of ML in music recommendation, the research prioritizes acoustic attributes over textual content. This highlights a methodological imbalance in the literature, where audio features dominate while lyrical modeling remains secondary.</w:t>
+        <w:t xml:space="preserve"> examines supervised learning techniques applied to Spotify’s structured audio attributes. The study demonstrates the strong predictive performance of machine learning models trained on features such as tempo, energy, and loudness. Although it confirms the applicability of ML in music recommendation, the research prioritizes acoustic attributes over textual content. This highlights a methodological imbalance in the literature, where audio features dominate while lyrical </w:t>
+      </w:r>
+      <w:proofErr w:type="spellStart"/>
+      <w:r>
+        <w:rPr>
+          <w:rFonts w:ascii="Times New Roman" w:hAnsi="Times New Roman" w:cs="Times New Roman"/>
+        </w:rPr>
+        <w:t>modeling</w:t>
+      </w:r>
+      <w:proofErr w:type="spellEnd"/>
+      <w:r>
+        <w:rPr>
+          <w:rFonts w:ascii="Times New Roman" w:hAnsi="Times New Roman" w:cs="Times New Roman"/>
+        </w:rPr>
+        <w:t xml:space="preserve"> remains secondary.</w:t>
       </w:r>
     </w:p>
     <w:p>
@@ -4357,7 +4759,35 @@
         <w:rPr>
           <w:rFonts w:ascii="Times New Roman" w:hAnsi="Times New Roman" w:cs="Times New Roman"/>
         </w:rPr>
-        <w:t xml:space="preserve"> introduces topic modeling techniques to extract thematic patterns from song lyrics. By identifying latent semantic themes, the authors improve recommendation relevance based on lyrical content. This work confirms that lyrics contain structured information valuable for similarity modeling. However, the reliance on latent topic models reduces interpretability compared to direct feature-engineered numeric representations.</w:t>
+        <w:t xml:space="preserve"> introduces topic </w:t>
+      </w:r>
+      <w:proofErr w:type="spellStart"/>
+      <w:r>
+        <w:rPr>
+          <w:rFonts w:ascii="Times New Roman" w:hAnsi="Times New Roman" w:cs="Times New Roman"/>
+        </w:rPr>
+        <w:t>modeling</w:t>
+      </w:r>
+      <w:proofErr w:type="spellEnd"/>
+      <w:r>
+        <w:rPr>
+          <w:rFonts w:ascii="Times New Roman" w:hAnsi="Times New Roman" w:cs="Times New Roman"/>
+        </w:rPr>
+        <w:t xml:space="preserve"> techniques to extract thematic patterns from song lyrics. By identifying latent semantic themes, the authors improve recommendation relevance based on lyrical content. This work confirms that lyrics contain structured information valuable for similarity </w:t>
+      </w:r>
+      <w:proofErr w:type="spellStart"/>
+      <w:r>
+        <w:rPr>
+          <w:rFonts w:ascii="Times New Roman" w:hAnsi="Times New Roman" w:cs="Times New Roman"/>
+        </w:rPr>
+        <w:t>modeling</w:t>
+      </w:r>
+      <w:proofErr w:type="spellEnd"/>
+      <w:r>
+        <w:rPr>
+          <w:rFonts w:ascii="Times New Roman" w:hAnsi="Times New Roman" w:cs="Times New Roman"/>
+        </w:rPr>
+        <w:t>. However, the reliance on latent topic models reduces interpretability compared to direct feature-engineered numeric representations.</w:t>
       </w:r>
     </w:p>
     <w:p>
@@ -4386,7 +4816,21 @@
         <w:rPr>
           <w:rFonts w:ascii="Times New Roman" w:hAnsi="Times New Roman" w:cs="Times New Roman"/>
         </w:rPr>
-        <w:t>, a text mining methodology is applied to lyrical corpora to generate recommendations based on similarity metrics. The experiment demonstrates that textual analysis alone can yield meaningful recommendations. Although exploratory in nature, this work provides empirical support for lyric-driven similarity modeling.</w:t>
+        <w:t xml:space="preserve">, a text mining methodology is applied to lyrical corpora to generate recommendations based on similarity metrics. The experiment demonstrates that textual analysis alone can yield meaningful recommendations. Although exploratory in nature, this work provides empirical support for lyric-driven similarity </w:t>
+      </w:r>
+      <w:proofErr w:type="spellStart"/>
+      <w:r>
+        <w:rPr>
+          <w:rFonts w:ascii="Times New Roman" w:hAnsi="Times New Roman" w:cs="Times New Roman"/>
+        </w:rPr>
+        <w:t>modeling</w:t>
+      </w:r>
+      <w:proofErr w:type="spellEnd"/>
+      <w:r>
+        <w:rPr>
+          <w:rFonts w:ascii="Times New Roman" w:hAnsi="Times New Roman" w:cs="Times New Roman"/>
+        </w:rPr>
+        <w:t>.</w:t>
       </w:r>
     </w:p>
     <w:p>
@@ -4421,13 +4865,45 @@
           <w:i/>
           <w:iCs/>
         </w:rPr>
-        <w:t>Mapping Emotion Scapes in Pop Song Lyrics</w:t>
-      </w:r>
-      <w:r>
-        <w:rPr>
-          <w:rFonts w:ascii="Times New Roman" w:hAnsi="Times New Roman" w:cs="Times New Roman"/>
-        </w:rPr>
-        <w:t xml:space="preserve"> investigates unsupervised clustering to analyze emotional patterns in lyrical datasets. The study demonstrates that lyric corpora naturally form thematic and emotional clusters when processed using clustering algorithms. This research strongly supports the feasibility of unsupervised pattern recognition in lyric analysis. However, its focus is analytical rather than application-driven, as it does not extend clustering results into a structured recommendation framework.</w:t>
+        <w:t xml:space="preserve">Mapping Emotion </w:t>
+      </w:r>
+      <w:proofErr w:type="spellStart"/>
+      <w:r>
+        <w:rPr>
+          <w:rFonts w:ascii="Times New Roman" w:hAnsi="Times New Roman" w:cs="Times New Roman"/>
+          <w:i/>
+          <w:iCs/>
+        </w:rPr>
+        <w:t>Scapes</w:t>
+      </w:r>
+      <w:proofErr w:type="spellEnd"/>
+      <w:r>
+        <w:rPr>
+          <w:rFonts w:ascii="Times New Roman" w:hAnsi="Times New Roman" w:cs="Times New Roman"/>
+          <w:i/>
+          <w:iCs/>
+        </w:rPr>
+        <w:t xml:space="preserve"> in Pop Song Lyrics</w:t>
+      </w:r>
+      <w:r>
+        <w:rPr>
+          <w:rFonts w:ascii="Times New Roman" w:hAnsi="Times New Roman" w:cs="Times New Roman"/>
+        </w:rPr>
+        <w:t xml:space="preserve"> investigates unsupervised clustering to </w:t>
+      </w:r>
+      <w:proofErr w:type="spellStart"/>
+      <w:r>
+        <w:rPr>
+          <w:rFonts w:ascii="Times New Roman" w:hAnsi="Times New Roman" w:cs="Times New Roman"/>
+        </w:rPr>
+        <w:t>analyze</w:t>
+      </w:r>
+      <w:proofErr w:type="spellEnd"/>
+      <w:r>
+        <w:rPr>
+          <w:rFonts w:ascii="Times New Roman" w:hAnsi="Times New Roman" w:cs="Times New Roman"/>
+        </w:rPr>
+        <w:t xml:space="preserve"> emotional patterns in lyrical datasets. The study demonstrates that lyric corpora naturally form thematic and emotional clusters when processed using clustering algorithms. This research strongly supports the feasibility of unsupervised pattern recognition in lyric analysis. However, its focus is analytical rather than application-driven, as it does not extend clustering results into a structured recommendation framework.</w:t>
       </w:r>
     </w:p>
     <w:p>
@@ -4480,7 +4956,21 @@
         <w:rPr>
           <w:rFonts w:ascii="Times New Roman" w:hAnsi="Times New Roman" w:cs="Times New Roman"/>
         </w:rPr>
-        <w:t>Most recommendation systems emphasize user behavior and audio features.</w:t>
+        <w:t xml:space="preserve">Most recommendation systems emphasize user </w:t>
+      </w:r>
+      <w:proofErr w:type="spellStart"/>
+      <w:r>
+        <w:rPr>
+          <w:rFonts w:ascii="Times New Roman" w:hAnsi="Times New Roman" w:cs="Times New Roman"/>
+        </w:rPr>
+        <w:t>behavior</w:t>
+      </w:r>
+      <w:proofErr w:type="spellEnd"/>
+      <w:r>
+        <w:rPr>
+          <w:rFonts w:ascii="Times New Roman" w:hAnsi="Times New Roman" w:cs="Times New Roman"/>
+        </w:rPr>
+        <w:t xml:space="preserve"> and audio features.</w:t>
       </w:r>
     </w:p>
     <w:p>
@@ -4516,7 +5006,21 @@
         <w:rPr>
           <w:rFonts w:ascii="Times New Roman" w:hAnsi="Times New Roman" w:cs="Times New Roman"/>
         </w:rPr>
-        <w:t>Topic modeling approaches reduce interpretability.</w:t>
+        <w:t xml:space="preserve">Topic </w:t>
+      </w:r>
+      <w:proofErr w:type="spellStart"/>
+      <w:r>
+        <w:rPr>
+          <w:rFonts w:ascii="Times New Roman" w:hAnsi="Times New Roman" w:cs="Times New Roman"/>
+        </w:rPr>
+        <w:t>modeling</w:t>
+      </w:r>
+      <w:proofErr w:type="spellEnd"/>
+      <w:r>
+        <w:rPr>
+          <w:rFonts w:ascii="Times New Roman" w:hAnsi="Times New Roman" w:cs="Times New Roman"/>
+        </w:rPr>
+        <w:t xml:space="preserve"> approaches reduce interpretability.</w:t>
       </w:r>
     </w:p>
     <w:p>
@@ -4807,7 +5311,21 @@
         <w:rPr>
           <w:rFonts w:ascii="Times New Roman" w:hAnsi="Times New Roman" w:cs="Times New Roman"/>
         </w:rPr>
-        <w:t xml:space="preserve">The primary objective of this project is to develop an AI-based system that analyzes lyrical patterns and recommends songs based on unsupervised learning. The goals include: </w:t>
+        <w:t xml:space="preserve">The primary objective of this project is to develop an AI-based system that </w:t>
+      </w:r>
+      <w:proofErr w:type="spellStart"/>
+      <w:r>
+        <w:rPr>
+          <w:rFonts w:ascii="Times New Roman" w:hAnsi="Times New Roman" w:cs="Times New Roman"/>
+        </w:rPr>
+        <w:t>analyzes</w:t>
+      </w:r>
+      <w:proofErr w:type="spellEnd"/>
+      <w:r>
+        <w:rPr>
+          <w:rFonts w:ascii="Times New Roman" w:hAnsi="Times New Roman" w:cs="Times New Roman"/>
+        </w:rPr>
+        <w:t xml:space="preserve"> lyrical patterns and recommends songs based on unsupervised learning. The goals include: </w:t>
       </w:r>
     </w:p>
     <w:p>
@@ -5081,7 +5599,21 @@
         <w:rPr>
           <w:rFonts w:cs="Times New Roman"/>
         </w:rPr>
-        <w:t xml:space="preserve">Vector Creation and Pattern Modeling </w:t>
+        <w:t xml:space="preserve">Vector Creation and Pattern </w:t>
+      </w:r>
+      <w:proofErr w:type="spellStart"/>
+      <w:r>
+        <w:rPr>
+          <w:rFonts w:cs="Times New Roman"/>
+        </w:rPr>
+        <w:t>Modeling</w:t>
+      </w:r>
+      <w:proofErr w:type="spellEnd"/>
+      <w:r>
+        <w:rPr>
+          <w:rFonts w:cs="Times New Roman"/>
+        </w:rPr>
+        <w:t xml:space="preserve"> </w:t>
       </w:r>
     </w:p>
     <w:p>
@@ -5895,7 +6427,25 @@
           <w:b/>
           <w:bCs/>
         </w:rPr>
-        <w:t>3. Modeling Phase</w:t>
+        <w:t xml:space="preserve">3. </w:t>
+      </w:r>
+      <w:proofErr w:type="spellStart"/>
+      <w:r>
+        <w:rPr>
+          <w:rFonts w:ascii="Times New Roman" w:hAnsi="Times New Roman" w:cs="Times New Roman"/>
+          <w:b/>
+          <w:bCs/>
+        </w:rPr>
+        <w:t>Modeling</w:t>
+      </w:r>
+      <w:proofErr w:type="spellEnd"/>
+      <w:r>
+        <w:rPr>
+          <w:rFonts w:ascii="Times New Roman" w:hAnsi="Times New Roman" w:cs="Times New Roman"/>
+          <w:b/>
+          <w:bCs/>
+        </w:rPr>
+        <w:t xml:space="preserve"> Phase</w:t>
       </w:r>
     </w:p>
     <w:p>
@@ -6097,6 +6647,24 @@
         <w:ind w:left="0" w:firstLine="0"/>
         <w:rPr>
           <w:rFonts w:ascii="Times New Roman" w:hAnsi="Times New Roman" w:cs="Times New Roman"/>
+        </w:rPr>
+      </w:pPr>
+    </w:p>
+    <w:p>
+      <w:pPr>
+        <w:spacing w:after="0" w:line="259" w:lineRule="auto"/>
+        <w:ind w:left="0" w:firstLine="0"/>
+        <w:rPr>
+          <w:rFonts w:ascii="Times New Roman" w:hAnsi="Times New Roman" w:cs="Times New Roman"/>
+        </w:rPr>
+      </w:pPr>
+    </w:p>
+    <w:p>
+      <w:pPr>
+        <w:spacing w:after="0" w:line="259" w:lineRule="auto"/>
+        <w:ind w:left="0" w:firstLine="0"/>
+        <w:rPr>
+          <w:rFonts w:ascii="Times New Roman" w:hAnsi="Times New Roman" w:cs="Times New Roman"/>
           <w:b/>
           <w:bCs/>
         </w:rPr>
@@ -6107,6 +6675,7 @@
           <w:b/>
           <w:bCs/>
         </w:rPr>
+        <w:lastRenderedPageBreak/>
         <w:t>5. Recommendation Layer</w:t>
       </w:r>
     </w:p>
@@ -6143,7 +6712,6 @@
         <w:rPr>
           <w:rFonts w:ascii="Times New Roman" w:hAnsi="Times New Roman" w:cs="Times New Roman"/>
         </w:rPr>
-        <w:lastRenderedPageBreak/>
         <w:t>Compute similarity within cluster</w:t>
       </w:r>
     </w:p>
@@ -6348,21 +6916,6 @@
           <w:rFonts w:ascii="Times New Roman" w:hAnsi="Times New Roman" w:cs="Times New Roman"/>
         </w:rPr>
       </w:pPr>
-    </w:p>
-    <w:p>
-      <w:pPr>
-        <w:spacing w:after="0" w:line="259" w:lineRule="auto"/>
-        <w:ind w:left="0" w:firstLine="0"/>
-        <w:rPr>
-          <w:rFonts w:ascii="Times New Roman" w:hAnsi="Times New Roman" w:cs="Times New Roman"/>
-        </w:rPr>
-      </w:pPr>
-      <w:r>
-        <w:rPr>
-          <w:rFonts w:ascii="Times New Roman" w:hAnsi="Times New Roman" w:cs="Times New Roman"/>
-        </w:rPr>
-        <w:t>If needed, this can be further upgraded into a formal diagram-ready version for your report.</w:t>
-      </w:r>
     </w:p>
     <w:p>
       <w:pPr>
@@ -6546,66 +7099,6 @@
     </w:p>
     <w:p>
       <w:pPr>
-        <w:tabs>
-          <w:tab w:val="left" w:pos="1696"/>
-        </w:tabs>
-        <w:spacing w:after="0" w:line="259" w:lineRule="auto"/>
-        <w:ind w:left="0" w:firstLine="0"/>
-        <w:rPr>
-          <w:rFonts w:ascii="Times New Roman" w:hAnsi="Times New Roman" w:cs="Times New Roman"/>
-        </w:rPr>
-      </w:pPr>
-    </w:p>
-    <w:p>
-      <w:pPr>
-        <w:tabs>
-          <w:tab w:val="left" w:pos="1696"/>
-        </w:tabs>
-        <w:spacing w:after="0" w:line="259" w:lineRule="auto"/>
-        <w:ind w:left="0" w:firstLine="0"/>
-        <w:rPr>
-          <w:rFonts w:ascii="Times New Roman" w:hAnsi="Times New Roman" w:cs="Times New Roman"/>
-        </w:rPr>
-      </w:pPr>
-    </w:p>
-    <w:p>
-      <w:pPr>
-        <w:tabs>
-          <w:tab w:val="left" w:pos="1696"/>
-        </w:tabs>
-        <w:spacing w:after="0" w:line="259" w:lineRule="auto"/>
-        <w:ind w:left="0" w:firstLine="0"/>
-        <w:rPr>
-          <w:rFonts w:ascii="Times New Roman" w:hAnsi="Times New Roman" w:cs="Times New Roman"/>
-        </w:rPr>
-      </w:pPr>
-    </w:p>
-    <w:p>
-      <w:pPr>
-        <w:tabs>
-          <w:tab w:val="left" w:pos="1696"/>
-        </w:tabs>
-        <w:spacing w:after="0" w:line="259" w:lineRule="auto"/>
-        <w:ind w:left="0" w:firstLine="0"/>
-        <w:rPr>
-          <w:rFonts w:ascii="Times New Roman" w:hAnsi="Times New Roman" w:cs="Times New Roman"/>
-        </w:rPr>
-      </w:pPr>
-    </w:p>
-    <w:p>
-      <w:pPr>
-        <w:tabs>
-          <w:tab w:val="left" w:pos="1696"/>
-        </w:tabs>
-        <w:spacing w:after="0" w:line="259" w:lineRule="auto"/>
-        <w:ind w:left="0" w:firstLine="0"/>
-        <w:rPr>
-          <w:rFonts w:ascii="Times New Roman" w:hAnsi="Times New Roman" w:cs="Times New Roman"/>
-        </w:rPr>
-      </w:pPr>
-    </w:p>
-    <w:p>
-      <w:pPr>
         <w:spacing w:after="0" w:line="259" w:lineRule="auto"/>
         <w:ind w:left="0" w:firstLine="0"/>
         <w:rPr>
@@ -6626,6 +7119,7 @@
           <w:rFonts w:ascii="Times New Roman" w:hAnsi="Times New Roman" w:cs="Times New Roman"/>
           <w:b/>
         </w:rPr>
+        <w:lastRenderedPageBreak/>
         <w:t xml:space="preserve"> </w:t>
       </w:r>
     </w:p>
@@ -6747,59 +7241,59 @@
         <w:rPr>
           <w:rFonts w:ascii="Times New Roman" w:hAnsi="Times New Roman" w:cs="Times New Roman"/>
         </w:rPr>
+        <w:t xml:space="preserve"> </w:t>
+      </w:r>
+    </w:p>
+    <w:p>
+      <w:pPr>
+        <w:spacing w:after="0" w:line="259" w:lineRule="auto"/>
+        <w:ind w:left="0" w:firstLine="0"/>
+        <w:rPr>
+          <w:rFonts w:ascii="Times New Roman" w:hAnsi="Times New Roman" w:cs="Times New Roman"/>
+        </w:rPr>
+      </w:pPr>
+    </w:p>
+    <w:p>
+      <w:pPr>
+        <w:spacing w:after="0" w:line="259" w:lineRule="auto"/>
+        <w:ind w:left="0" w:firstLine="0"/>
+        <w:rPr>
+          <w:rFonts w:ascii="Times New Roman" w:hAnsi="Times New Roman" w:cs="Times New Roman"/>
+        </w:rPr>
+      </w:pPr>
+    </w:p>
+    <w:p>
+      <w:pPr>
+        <w:spacing w:after="0" w:line="259" w:lineRule="auto"/>
+        <w:ind w:left="0" w:firstLine="0"/>
+        <w:rPr>
+          <w:rFonts w:ascii="Times New Roman" w:hAnsi="Times New Roman" w:cs="Times New Roman"/>
+        </w:rPr>
+      </w:pPr>
+    </w:p>
+    <w:p>
+      <w:pPr>
+        <w:spacing w:after="0" w:line="259" w:lineRule="auto"/>
+        <w:ind w:left="0" w:firstLine="0"/>
+        <w:rPr>
+          <w:rFonts w:ascii="Times New Roman" w:hAnsi="Times New Roman" w:cs="Times New Roman"/>
+        </w:rPr>
+      </w:pPr>
+    </w:p>
+    <w:p>
+      <w:pPr>
+        <w:spacing w:after="0" w:line="259" w:lineRule="auto"/>
+        <w:ind w:left="0" w:firstLine="0"/>
+        <w:rPr>
+          <w:rFonts w:ascii="Times New Roman" w:hAnsi="Times New Roman" w:cs="Times New Roman"/>
+        </w:rPr>
+      </w:pPr>
+      <w:r>
+        <w:rPr>
+          <w:rFonts w:ascii="Times New Roman" w:hAnsi="Times New Roman" w:cs="Times New Roman"/>
+          <w:b/>
+        </w:rPr>
         <w:lastRenderedPageBreak/>
-        <w:t xml:space="preserve"> </w:t>
-      </w:r>
-    </w:p>
-    <w:p>
-      <w:pPr>
-        <w:spacing w:after="0" w:line="259" w:lineRule="auto"/>
-        <w:ind w:left="0" w:firstLine="0"/>
-        <w:rPr>
-          <w:rFonts w:ascii="Times New Roman" w:hAnsi="Times New Roman" w:cs="Times New Roman"/>
-        </w:rPr>
-      </w:pPr>
-    </w:p>
-    <w:p>
-      <w:pPr>
-        <w:spacing w:after="0" w:line="259" w:lineRule="auto"/>
-        <w:ind w:left="0" w:firstLine="0"/>
-        <w:rPr>
-          <w:rFonts w:ascii="Times New Roman" w:hAnsi="Times New Roman" w:cs="Times New Roman"/>
-        </w:rPr>
-      </w:pPr>
-    </w:p>
-    <w:p>
-      <w:pPr>
-        <w:spacing w:after="0" w:line="259" w:lineRule="auto"/>
-        <w:ind w:left="0" w:firstLine="0"/>
-        <w:rPr>
-          <w:rFonts w:ascii="Times New Roman" w:hAnsi="Times New Roman" w:cs="Times New Roman"/>
-        </w:rPr>
-      </w:pPr>
-    </w:p>
-    <w:p>
-      <w:pPr>
-        <w:spacing w:after="0" w:line="259" w:lineRule="auto"/>
-        <w:ind w:left="0" w:firstLine="0"/>
-        <w:rPr>
-          <w:rFonts w:ascii="Times New Roman" w:hAnsi="Times New Roman" w:cs="Times New Roman"/>
-        </w:rPr>
-      </w:pPr>
-    </w:p>
-    <w:p>
-      <w:pPr>
-        <w:spacing w:after="0" w:line="259" w:lineRule="auto"/>
-        <w:ind w:left="0" w:firstLine="0"/>
-        <w:rPr>
-          <w:rFonts w:ascii="Times New Roman" w:hAnsi="Times New Roman" w:cs="Times New Roman"/>
-        </w:rPr>
-      </w:pPr>
-      <w:r>
-        <w:rPr>
-          <w:rFonts w:ascii="Times New Roman" w:hAnsi="Times New Roman" w:cs="Times New Roman"/>
-          <w:b/>
-        </w:rPr>
         <w:t xml:space="preserve"> </w:t>
       </w:r>
     </w:p>
@@ -6986,7 +7480,35 @@
         <w:rPr>
           <w:rFonts w:ascii="Times New Roman" w:hAnsi="Times New Roman" w:cs="Times New Roman"/>
         </w:rPr>
-        <w:t xml:space="preserve">. Revue d’Intelligence Artificielle. </w:t>
+        <w:t xml:space="preserve">. Revue </w:t>
+      </w:r>
+      <w:proofErr w:type="spellStart"/>
+      <w:r>
+        <w:rPr>
+          <w:rFonts w:ascii="Times New Roman" w:hAnsi="Times New Roman" w:cs="Times New Roman"/>
+        </w:rPr>
+        <w:t>d’Intelligence</w:t>
+      </w:r>
+      <w:proofErr w:type="spellEnd"/>
+      <w:r>
+        <w:rPr>
+          <w:rFonts w:ascii="Times New Roman" w:hAnsi="Times New Roman" w:cs="Times New Roman"/>
+        </w:rPr>
+        <w:t xml:space="preserve"> </w:t>
+      </w:r>
+      <w:proofErr w:type="spellStart"/>
+      <w:r>
+        <w:rPr>
+          <w:rFonts w:ascii="Times New Roman" w:hAnsi="Times New Roman" w:cs="Times New Roman"/>
+        </w:rPr>
+        <w:t>Artificielle</w:t>
+      </w:r>
+      <w:proofErr w:type="spellEnd"/>
+      <w:r>
+        <w:rPr>
+          <w:rFonts w:ascii="Times New Roman" w:hAnsi="Times New Roman" w:cs="Times New Roman"/>
+        </w:rPr>
+        <w:t xml:space="preserve">. </w:t>
       </w:r>
       <w:hyperlink r:id="rId14" w:history="1">
         <w:r>
@@ -7056,7 +7578,25 @@
           <w:i/>
           <w:iCs/>
         </w:rPr>
-        <w:t>Mapping emotion scapes in pop song lyrics (unsupervised clustering discussion)</w:t>
+        <w:t xml:space="preserve">Mapping emotion </w:t>
+      </w:r>
+      <w:proofErr w:type="spellStart"/>
+      <w:r>
+        <w:rPr>
+          <w:rFonts w:ascii="Times New Roman" w:hAnsi="Times New Roman" w:cs="Times New Roman"/>
+          <w:i/>
+          <w:iCs/>
+        </w:rPr>
+        <w:t>scapes</w:t>
+      </w:r>
+      <w:proofErr w:type="spellEnd"/>
+      <w:r>
+        <w:rPr>
+          <w:rFonts w:ascii="Times New Roman" w:hAnsi="Times New Roman" w:cs="Times New Roman"/>
+          <w:i/>
+          <w:iCs/>
+        </w:rPr>
+        <w:t xml:space="preserve"> in pop song lyrics (unsupervised clustering discussion)</w:t>
       </w:r>
       <w:r>
         <w:rPr>
@@ -13168,6 +13708,7 @@
   <w:style w:type="character" w:default="1" w:styleId="DefaultParagraphFont">
     <w:name w:val="Default Paragraph Font"/>
     <w:uiPriority w:val="1"/>
+    <w:semiHidden/>
     <w:unhideWhenUsed/>
   </w:style>
   <w:style w:type="table" w:default="1" w:styleId="TableNormal">

</xml_diff>